<commit_message>
Refine organization description and target impact; update timeline, budget, and references for clarity and consistency. Remove unused HTML files.
</commit_message>
<xml_diff>
--- a/Docs/WEDE5020 POE Part 1-Planning DirectLink Africa.docx
+++ b/Docs/WEDE5020 POE Part 1-Planning DirectLink Africa.docx
@@ -532,7 +532,23 @@
           <w:szCs w:val="22"/>
           <w:lang w:val="en-GB"/>
         </w:rPr>
-        <w:t xml:space="preserve"> transparent giving from all around the world directly to Northern and Sub-Saharan Africa. </w:t>
+        <w:t xml:space="preserve"> transparent</w:t>
+      </w:r>
+      <w:r>
+        <w:rPr>
+          <w:sz w:val="22"/>
+          <w:szCs w:val="22"/>
+          <w:lang w:val="en-GB"/>
+        </w:rPr>
+        <w:t>,</w:t>
+      </w:r>
+      <w:r>
+        <w:rPr>
+          <w:sz w:val="22"/>
+          <w:szCs w:val="22"/>
+          <w:lang w:val="en-GB"/>
+        </w:rPr>
+        <w:t xml:space="preserve"> giving from all around the world directly to Northern and Sub-Saharan Africa. </w:t>
       </w:r>
     </w:p>
     <w:p>
@@ -727,7 +743,39 @@
           <w:szCs w:val="22"/>
           <w:lang w:val="en-GB"/>
         </w:rPr>
-        <w:t xml:space="preserve">Z and Millennials that want to give back as well as </w:t>
+        <w:t xml:space="preserve">Z and Millennials </w:t>
+      </w:r>
+      <w:r>
+        <w:rPr>
+          <w:sz w:val="22"/>
+          <w:szCs w:val="22"/>
+          <w:lang w:val="en-GB"/>
+        </w:rPr>
+        <w:t>who</w:t>
+      </w:r>
+      <w:r>
+        <w:rPr>
+          <w:sz w:val="22"/>
+          <w:szCs w:val="22"/>
+          <w:lang w:val="en-GB"/>
+        </w:rPr>
+        <w:t xml:space="preserve"> want to give back</w:t>
+      </w:r>
+      <w:r>
+        <w:rPr>
+          <w:sz w:val="22"/>
+          <w:szCs w:val="22"/>
+          <w:lang w:val="en-GB"/>
+        </w:rPr>
+        <w:t>,</w:t>
+      </w:r>
+      <w:r>
+        <w:rPr>
+          <w:sz w:val="22"/>
+          <w:szCs w:val="22"/>
+          <w:lang w:val="en-GB"/>
+        </w:rPr>
+        <w:t xml:space="preserve"> as well as </w:t>
       </w:r>
       <w:r>
         <w:rPr>
@@ -1721,7 +1769,7 @@
           <w:bCs/>
           <w:lang w:val="en-GB"/>
         </w:rPr>
-        <w:t>Figure 1</w:t>
+        <w:t>Figure 1: Coolors, 2026.</w:t>
       </w:r>
     </w:p>
     <w:p>
@@ -2281,6 +2329,89 @@
     <w:p>
       <w:pPr>
         <w:pStyle w:val="ListParagraph"/>
+        <w:numPr>
+          <w:ilvl w:val="0"/>
+          <w:numId w:val="7"/>
+        </w:numPr>
+        <w:rPr>
+          <w:b/>
+          <w:bCs/>
+          <w:lang w:val="en-GB"/>
+        </w:rPr>
+      </w:pPr>
+      <w:r>
+        <w:rPr>
+          <w:b/>
+          <w:bCs/>
+          <w:lang w:val="en-GB"/>
+        </w:rPr>
+        <w:lastRenderedPageBreak/>
+        <w:t>Enquiries</w:t>
+      </w:r>
+    </w:p>
+    <w:p>
+      <w:pPr>
+        <w:pStyle w:val="ListParagraph"/>
+        <w:ind w:left="1080"/>
+        <w:rPr>
+          <w:b/>
+          <w:bCs/>
+          <w:lang w:val="en-GB"/>
+        </w:rPr>
+      </w:pPr>
+      <w:r>
+        <w:rPr>
+          <w:b/>
+          <w:bCs/>
+          <w:noProof/>
+          <w:lang w:val="en-GB"/>
+        </w:rPr>
+        <w:drawing>
+          <wp:inline distT="0" distB="0" distL="0" distR="0" wp14:anchorId="2EF80FD4" wp14:editId="773A75EE">
+            <wp:extent cx="5731510" cy="3223895"/>
+            <wp:effectExtent l="0" t="0" r="2540" b="0"/>
+            <wp:docPr id="1875880387" name="Picture 1"/>
+            <wp:cNvGraphicFramePr>
+              <a:graphicFrameLocks xmlns:a="http://schemas.openxmlformats.org/drawingml/2006/main" noChangeAspect="1"/>
+            </wp:cNvGraphicFramePr>
+            <a:graphic xmlns:a="http://schemas.openxmlformats.org/drawingml/2006/main">
+              <a:graphicData uri="http://schemas.openxmlformats.org/drawingml/2006/picture">
+                <pic:pic xmlns:pic="http://schemas.openxmlformats.org/drawingml/2006/picture">
+                  <pic:nvPicPr>
+                    <pic:cNvPr id="1875880387" name="Picture 1875880387"/>
+                    <pic:cNvPicPr/>
+                  </pic:nvPicPr>
+                  <pic:blipFill>
+                    <a:blip r:embed="rId9" cstate="print">
+                      <a:extLst>
+                        <a:ext uri="{28A0092B-C50C-407E-A947-70E740481C1C}">
+                          <a14:useLocalDpi xmlns:a14="http://schemas.microsoft.com/office/drawing/2010/main" val="0"/>
+                        </a:ext>
+                      </a:extLst>
+                    </a:blip>
+                    <a:stretch>
+                      <a:fillRect/>
+                    </a:stretch>
+                  </pic:blipFill>
+                  <pic:spPr>
+                    <a:xfrm>
+                      <a:off x="0" y="0"/>
+                      <a:ext cx="5731510" cy="3223895"/>
+                    </a:xfrm>
+                    <a:prstGeom prst="rect">
+                      <a:avLst/>
+                    </a:prstGeom>
+                  </pic:spPr>
+                </pic:pic>
+              </a:graphicData>
+            </a:graphic>
+          </wp:inline>
+        </w:drawing>
+      </w:r>
+    </w:p>
+    <w:p>
+      <w:pPr>
+        <w:pStyle w:val="ListParagraph"/>
         <w:ind w:left="1080"/>
         <w:rPr>
           <w:b/>
@@ -2344,7 +2475,7 @@
                     <pic:cNvPicPr/>
                   </pic:nvPicPr>
                   <pic:blipFill>
-                    <a:blip r:embed="rId9">
+                    <a:blip r:embed="rId10">
                       <a:extLst>
                         <a:ext uri="{28A0092B-C50C-407E-A947-70E740481C1C}">
                           <a14:useLocalDpi xmlns:a14="http://schemas.microsoft.com/office/drawing/2010/main" val="0"/>
@@ -2518,7 +2649,7 @@
         </w:rPr>
         <w:t xml:space="preserve">frica Link: </w:t>
       </w:r>
-      <w:hyperlink r:id="rId10" w:history="1">
+      <w:hyperlink r:id="rId11" w:history="1">
         <w:r>
           <w:rPr>
             <w:rStyle w:val="Hyperlink"/>
@@ -2623,7 +2754,16 @@
           <w:bCs/>
           <w:lang w:val="en-GB"/>
         </w:rPr>
-        <w:t xml:space="preserve">Time-Period: </w:t>
+        <w:lastRenderedPageBreak/>
+        <w:t>Time Period</w:t>
+      </w:r>
+      <w:r>
+        <w:rPr>
+          <w:b/>
+          <w:bCs/>
+          <w:lang w:val="en-GB"/>
+        </w:rPr>
+        <w:t xml:space="preserve">: </w:t>
       </w:r>
       <w:r>
         <w:rPr>
@@ -2739,7 +2879,19 @@
         <w:rPr>
           <w:lang w:val="en-GB"/>
         </w:rPr>
-        <w:t>Test website and make sure its in full working order</w:t>
+        <w:t xml:space="preserve">Test website and make sure </w:t>
+      </w:r>
+      <w:r>
+        <w:rPr>
+          <w:lang w:val="en-GB"/>
+        </w:rPr>
+        <w:t>it's</w:t>
+      </w:r>
+      <w:r>
+        <w:rPr>
+          <w:lang w:val="en-GB"/>
+        </w:rPr>
+        <w:t xml:space="preserve"> in full working order</w:t>
       </w:r>
     </w:p>
     <w:p>
@@ -2811,7 +2963,19 @@
         <w:rPr>
           <w:lang w:val="en-GB"/>
         </w:rPr>
-        <w:t xml:space="preserve"> once off </w:t>
+        <w:t xml:space="preserve"> </w:t>
+      </w:r>
+      <w:r>
+        <w:rPr>
+          <w:lang w:val="en-GB"/>
+        </w:rPr>
+        <w:t>once-off</w:t>
+      </w:r>
+      <w:r>
+        <w:rPr>
+          <w:lang w:val="en-GB"/>
+        </w:rPr>
+        <w:t xml:space="preserve"> </w:t>
       </w:r>
     </w:p>
     <w:p>
@@ -2837,7 +3001,19 @@
         <w:rPr>
           <w:lang w:val="en-GB"/>
         </w:rPr>
-        <w:t xml:space="preserve"> R700,00 Per month</w:t>
+        <w:t xml:space="preserve"> R700,00 </w:t>
+      </w:r>
+      <w:r>
+        <w:rPr>
+          <w:lang w:val="en-GB"/>
+        </w:rPr>
+        <w:t>per</w:t>
+      </w:r>
+      <w:r>
+        <w:rPr>
+          <w:lang w:val="en-GB"/>
+        </w:rPr>
+        <w:t xml:space="preserve"> month</w:t>
       </w:r>
     </w:p>
     <w:p>
@@ -2927,7 +3103,6 @@
         <w:rPr>
           <w:lang w:val="en-GB"/>
         </w:rPr>
-        <w:lastRenderedPageBreak/>
         <w:t>Reference List:</w:t>
       </w:r>
     </w:p>
@@ -2952,7 +3127,7 @@
         </w:rPr>
         <w:t xml:space="preserve">[online] Available at: </w:t>
       </w:r>
-      <w:hyperlink r:id="rId11" w:history="1">
+      <w:hyperlink r:id="rId12" w:history="1">
         <w:r>
           <w:rPr>
             <w:rStyle w:val="Hyperlink"/>
@@ -2967,6 +3142,23 @@
     <w:p/>
     <w:p>
       <w:r>
+        <w:t>Coolors, 2026. Color palette: #7CFEF0, #6BFFB8, #2CEAA3, #28965A, #2A6041. [online] Available at: </w:t>
+      </w:r>
+      <w:hyperlink r:id="rId13" w:history="1">
+        <w:r>
+          <w:rPr>
+            <w:rStyle w:val="Hyperlink"/>
+          </w:rPr>
+          <w:t>https://coolors.co/7cfef0-6bffb8-2ceaa3-28965a-2a6041</w:t>
+        </w:r>
+      </w:hyperlink>
+      <w:r>
+        <w:t> [Accessed 24 July 2026].</w:t>
+      </w:r>
+    </w:p>
+    <w:p/>
+    <w:p>
+      <w:r>
         <w:t xml:space="preserve">NetSuite, 2026. </w:t>
       </w:r>
       <w:r>
@@ -2996,7 +3188,7 @@
       <w:r>
         <w:t xml:space="preserve">Available at: </w:t>
       </w:r>
-      <w:hyperlink r:id="rId12" w:history="1">
+      <w:hyperlink r:id="rId14" w:history="1">
         <w:r>
           <w:rPr>
             <w:rStyle w:val="Hyperlink"/>
@@ -3276,6 +3468,155 @@
     </w:lvl>
   </w:abstractNum>
   <w:abstractNum w:abstractNumId="2" w15:restartNumberingAfterBreak="0">
+    <w:nsid w:val="1FDA2C1A"/>
+    <w:multiLevelType w:val="multilevel"/>
+    <w:tmpl w:val="531A74C2"/>
+    <w:lvl w:ilvl="0">
+      <w:start w:val="1"/>
+      <w:numFmt w:val="bullet"/>
+      <w:lvlText w:val=""/>
+      <w:lvlJc w:val="left"/>
+      <w:pPr>
+        <w:tabs>
+          <w:tab w:val="num" w:pos="720"/>
+        </w:tabs>
+        <w:ind w:left="720" w:hanging="360"/>
+      </w:pPr>
+      <w:rPr>
+        <w:rFonts w:ascii="Symbol" w:hAnsi="Symbol" w:hint="default"/>
+        <w:sz w:val="20"/>
+      </w:rPr>
+    </w:lvl>
+    <w:lvl w:ilvl="1" w:tentative="1">
+      <w:start w:val="1"/>
+      <w:numFmt w:val="bullet"/>
+      <w:lvlText w:val="o"/>
+      <w:lvlJc w:val="left"/>
+      <w:pPr>
+        <w:tabs>
+          <w:tab w:val="num" w:pos="1440"/>
+        </w:tabs>
+        <w:ind w:left="1440" w:hanging="360"/>
+      </w:pPr>
+      <w:rPr>
+        <w:rFonts w:ascii="Courier New" w:hAnsi="Courier New" w:hint="default"/>
+        <w:sz w:val="20"/>
+      </w:rPr>
+    </w:lvl>
+    <w:lvl w:ilvl="2" w:tentative="1">
+      <w:start w:val="1"/>
+      <w:numFmt w:val="bullet"/>
+      <w:lvlText w:val=""/>
+      <w:lvlJc w:val="left"/>
+      <w:pPr>
+        <w:tabs>
+          <w:tab w:val="num" w:pos="2160"/>
+        </w:tabs>
+        <w:ind w:left="2160" w:hanging="360"/>
+      </w:pPr>
+      <w:rPr>
+        <w:rFonts w:ascii="Wingdings" w:hAnsi="Wingdings" w:hint="default"/>
+        <w:sz w:val="20"/>
+      </w:rPr>
+    </w:lvl>
+    <w:lvl w:ilvl="3" w:tentative="1">
+      <w:start w:val="1"/>
+      <w:numFmt w:val="bullet"/>
+      <w:lvlText w:val=""/>
+      <w:lvlJc w:val="left"/>
+      <w:pPr>
+        <w:tabs>
+          <w:tab w:val="num" w:pos="2880"/>
+        </w:tabs>
+        <w:ind w:left="2880" w:hanging="360"/>
+      </w:pPr>
+      <w:rPr>
+        <w:rFonts w:ascii="Wingdings" w:hAnsi="Wingdings" w:hint="default"/>
+        <w:sz w:val="20"/>
+      </w:rPr>
+    </w:lvl>
+    <w:lvl w:ilvl="4" w:tentative="1">
+      <w:start w:val="1"/>
+      <w:numFmt w:val="bullet"/>
+      <w:lvlText w:val=""/>
+      <w:lvlJc w:val="left"/>
+      <w:pPr>
+        <w:tabs>
+          <w:tab w:val="num" w:pos="3600"/>
+        </w:tabs>
+        <w:ind w:left="3600" w:hanging="360"/>
+      </w:pPr>
+      <w:rPr>
+        <w:rFonts w:ascii="Wingdings" w:hAnsi="Wingdings" w:hint="default"/>
+        <w:sz w:val="20"/>
+      </w:rPr>
+    </w:lvl>
+    <w:lvl w:ilvl="5" w:tentative="1">
+      <w:start w:val="1"/>
+      <w:numFmt w:val="bullet"/>
+      <w:lvlText w:val=""/>
+      <w:lvlJc w:val="left"/>
+      <w:pPr>
+        <w:tabs>
+          <w:tab w:val="num" w:pos="4320"/>
+        </w:tabs>
+        <w:ind w:left="4320" w:hanging="360"/>
+      </w:pPr>
+      <w:rPr>
+        <w:rFonts w:ascii="Wingdings" w:hAnsi="Wingdings" w:hint="default"/>
+        <w:sz w:val="20"/>
+      </w:rPr>
+    </w:lvl>
+    <w:lvl w:ilvl="6" w:tentative="1">
+      <w:start w:val="1"/>
+      <w:numFmt w:val="bullet"/>
+      <w:lvlText w:val=""/>
+      <w:lvlJc w:val="left"/>
+      <w:pPr>
+        <w:tabs>
+          <w:tab w:val="num" w:pos="5040"/>
+        </w:tabs>
+        <w:ind w:left="5040" w:hanging="360"/>
+      </w:pPr>
+      <w:rPr>
+        <w:rFonts w:ascii="Wingdings" w:hAnsi="Wingdings" w:hint="default"/>
+        <w:sz w:val="20"/>
+      </w:rPr>
+    </w:lvl>
+    <w:lvl w:ilvl="7" w:tentative="1">
+      <w:start w:val="1"/>
+      <w:numFmt w:val="bullet"/>
+      <w:lvlText w:val=""/>
+      <w:lvlJc w:val="left"/>
+      <w:pPr>
+        <w:tabs>
+          <w:tab w:val="num" w:pos="5760"/>
+        </w:tabs>
+        <w:ind w:left="5760" w:hanging="360"/>
+      </w:pPr>
+      <w:rPr>
+        <w:rFonts w:ascii="Wingdings" w:hAnsi="Wingdings" w:hint="default"/>
+        <w:sz w:val="20"/>
+      </w:rPr>
+    </w:lvl>
+    <w:lvl w:ilvl="8" w:tentative="1">
+      <w:start w:val="1"/>
+      <w:numFmt w:val="bullet"/>
+      <w:lvlText w:val=""/>
+      <w:lvlJc w:val="left"/>
+      <w:pPr>
+        <w:tabs>
+          <w:tab w:val="num" w:pos="6480"/>
+        </w:tabs>
+        <w:ind w:left="6480" w:hanging="360"/>
+      </w:pPr>
+      <w:rPr>
+        <w:rFonts w:ascii="Wingdings" w:hAnsi="Wingdings" w:hint="default"/>
+        <w:sz w:val="20"/>
+      </w:rPr>
+    </w:lvl>
+  </w:abstractNum>
+  <w:abstractNum w:abstractNumId="3" w15:restartNumberingAfterBreak="0">
     <w:nsid w:val="3A59328B"/>
     <w:multiLevelType w:val="hybridMultilevel"/>
     <w:tmpl w:val="0090E750"/>
@@ -3364,7 +3705,7 @@
       </w:pPr>
     </w:lvl>
   </w:abstractNum>
-  <w:abstractNum w:abstractNumId="3" w15:restartNumberingAfterBreak="0">
+  <w:abstractNum w:abstractNumId="4" w15:restartNumberingAfterBreak="0">
     <w:nsid w:val="493E0E07"/>
     <w:multiLevelType w:val="hybridMultilevel"/>
     <w:tmpl w:val="CF5A4CA6"/>
@@ -3454,7 +3795,7 @@
       </w:pPr>
     </w:lvl>
   </w:abstractNum>
-  <w:abstractNum w:abstractNumId="4" w15:restartNumberingAfterBreak="0">
+  <w:abstractNum w:abstractNumId="5" w15:restartNumberingAfterBreak="0">
     <w:nsid w:val="4CFC25DD"/>
     <w:multiLevelType w:val="hybridMultilevel"/>
     <w:tmpl w:val="111EEDB0"/>
@@ -3543,7 +3884,7 @@
       </w:pPr>
     </w:lvl>
   </w:abstractNum>
-  <w:abstractNum w:abstractNumId="5" w15:restartNumberingAfterBreak="0">
+  <w:abstractNum w:abstractNumId="6" w15:restartNumberingAfterBreak="0">
     <w:nsid w:val="6E6F55F2"/>
     <w:multiLevelType w:val="hybridMultilevel"/>
     <w:tmpl w:val="2EBE98B4"/>
@@ -3656,7 +3997,7 @@
       </w:rPr>
     </w:lvl>
   </w:abstractNum>
-  <w:abstractNum w:abstractNumId="6" w15:restartNumberingAfterBreak="0">
+  <w:abstractNum w:abstractNumId="7" w15:restartNumberingAfterBreak="0">
     <w:nsid w:val="73A12824"/>
     <w:multiLevelType w:val="multilevel"/>
     <w:tmpl w:val="D1E6FCA4"/>
@@ -3777,7 +4118,7 @@
       </w:rPr>
     </w:lvl>
   </w:abstractNum>
-  <w:abstractNum w:abstractNumId="7" w15:restartNumberingAfterBreak="0">
+  <w:abstractNum w:abstractNumId="8" w15:restartNumberingAfterBreak="0">
     <w:nsid w:val="7C5938EC"/>
     <w:multiLevelType w:val="hybridMultilevel"/>
     <w:tmpl w:val="CC0CA150"/>
@@ -3891,7 +4232,7 @@
       </w:rPr>
     </w:lvl>
   </w:abstractNum>
-  <w:abstractNum w:abstractNumId="8" w15:restartNumberingAfterBreak="0">
+  <w:abstractNum w:abstractNumId="9" w15:restartNumberingAfterBreak="0">
     <w:nsid w:val="7C83745C"/>
     <w:multiLevelType w:val="hybridMultilevel"/>
     <w:tmpl w:val="B164BF16"/>
@@ -3981,31 +4322,34 @@
     </w:lvl>
   </w:abstractNum>
   <w:num w:numId="1" w16cid:durableId="692536433">
-    <w:abstractNumId w:val="6"/>
+    <w:abstractNumId w:val="7"/>
   </w:num>
   <w:num w:numId="2" w16cid:durableId="1667787326">
     <w:abstractNumId w:val="0"/>
   </w:num>
   <w:num w:numId="3" w16cid:durableId="754283917">
-    <w:abstractNumId w:val="2"/>
+    <w:abstractNumId w:val="3"/>
   </w:num>
   <w:num w:numId="4" w16cid:durableId="1378822705">
+    <w:abstractNumId w:val="9"/>
+  </w:num>
+  <w:num w:numId="5" w16cid:durableId="70929531">
     <w:abstractNumId w:val="8"/>
   </w:num>
-  <w:num w:numId="5" w16cid:durableId="70929531">
-    <w:abstractNumId w:val="7"/>
-  </w:num>
   <w:num w:numId="6" w16cid:durableId="994575587">
-    <w:abstractNumId w:val="3"/>
+    <w:abstractNumId w:val="4"/>
   </w:num>
   <w:num w:numId="7" w16cid:durableId="1233933328">
-    <w:abstractNumId w:val="5"/>
+    <w:abstractNumId w:val="6"/>
   </w:num>
   <w:num w:numId="8" w16cid:durableId="167722777">
     <w:abstractNumId w:val="1"/>
   </w:num>
   <w:num w:numId="9" w16cid:durableId="1792900928">
-    <w:abstractNumId w:val="4"/>
+    <w:abstractNumId w:val="5"/>
+  </w:num>
+  <w:num w:numId="10" w16cid:durableId="1620800305">
+    <w:abstractNumId w:val="2"/>
   </w:num>
 </w:numbering>
 </file>
@@ -4612,7 +4956,6 @@
   <w:style w:type="character" w:default="1" w:styleId="DefaultParagraphFont">
     <w:name w:val="Default Paragraph Font"/>
     <w:uiPriority w:val="1"/>
-    <w:semiHidden/>
     <w:unhideWhenUsed/>
   </w:style>
   <w:style w:type="table" w:default="1" w:styleId="TableNormal">

</xml_diff>